<commit_message>
Add editable diploma template source
Co-authored-by: Pastuhh <WorkPastuhh@users.noreply.github.com>
</commit_message>
<xml_diff>
--- a/docs/diploma_work_template_kesi.docx
+++ b/docs/diploma_work_template_kesi.docx
@@ -4,12 +4,17 @@
   <w:body>
     <w:p>
       <w:r>
-        <w:t xml:space="preserve">РАБОЧИЙ ШАБЛОН ДИПЛОМНОЙ РАБОТЫ</w:t>
+        <w:t xml:space="preserve">Рабочий шаблон дипломной работы</w:t>
       </w:r>
     </w:p>
     <w:p>
       <w:r>
-        <w:t xml:space="preserve">Тема дипломной работы: Разработка мобильного приложения "Судоку" для игровой студии.</w:t>
+        <w:t xml:space="preserve">Тема дипломной работы</w:t>
+      </w:r>
+    </w:p>
+    <w:p>
+      <w:r>
+        <w:t xml:space="preserve">Разработка мобильного приложения "Судоку" для игровой студии.</w:t>
       </w:r>
     </w:p>
     <w:p>
@@ -39,37 +44,7 @@
     </w:p>
     <w:p>
       <w:r>
-        <w:t xml:space="preserve">1. Исследовать предметную область мобильных игр на примере логической игры Судоку и определить требования к мобильному приложению.</w:t>
-      </w:r>
-    </w:p>
-    <w:p>
-      <w:r>
-        <w:t xml:space="preserve">2. Провести анализ существующих мобильных приложений Судоку и сравнить их по функциональности, пользовательским оценкам и особенностям реализации.</w:t>
-      </w:r>
-    </w:p>
-    <w:p>
-      <w:r>
-        <w:t xml:space="preserve">3. Сформировать функциональные и нефункциональные требования, включая надежность, безопасность и обработку персональных данных.</w:t>
-      </w:r>
-    </w:p>
-    <w:p>
-      <w:r>
-        <w:t xml:space="preserve">4. Разработать архитектуру программного обеспечения, UML-диаграммы и модель базы данных для хранения пользовательских данных и результатов игры.</w:t>
-      </w:r>
-    </w:p>
-    <w:p>
-      <w:r>
-        <w:t xml:space="preserve">5. Реализовать мобильное приложение Судоку на Kotlin с использованием PostgreSQL для хранения данных.</w:t>
-      </w:r>
-    </w:p>
-    <w:p>
-      <w:r>
-        <w:t xml:space="preserve">6. Реализовать дополнительный функционал: турниры между пользователями, подписку на темы оформления и механизмы внутриигрового взаимодействия.</w:t>
-      </w:r>
-    </w:p>
-    <w:p>
-      <w:r>
-        <w:t xml:space="preserve">7. Оценить экономическую эффективность разработки и предложить бизнес-модель монетизации, включающую подписку, внутриигровые покупки и проведение турниров.</w:t>
+        <w:t xml:space="preserve">1. Исследовать предметную область мобильных игр на примере логической игры Судоку и определить требования к мобильному приложению. 2. Провести анализ существующих мобильных приложений Судоку и сравнить их по функциональности, пользовательским оценкам и особенностям реализации. 3. Сформировать функциональные и нефункциональные требования, включая надежность, безопасность и обработку персональных данных. 4. Разработать архитектуру программного обеспечения, UML-диаграммы и модель базы данных для хранения пользовательских данных и результатов игры. 5. Реализовать мобильное приложение Судоку на Kotlin с использованием PostgreSQL для хранения данных. 6. Реализовать дополнительный функционал: турниры между пользователями, подписку на темы оформления и механизмы внутриигрового взаимодействия. 7. Оценить экономическую эффективность разработки и предложить бизнес-модель монетизации, включающую подписку, внутриигровые покупки и проведение турниров.</w:t>
       </w:r>
     </w:p>
     <w:p>
@@ -99,27 +74,7 @@
     </w:p>
     <w:p>
       <w:r>
-        <w:t xml:space="preserve">1. ГОСТ 7.32-2017 "Отчет о научно-исследовательской работе. Структура и правила оформления". [источник]</w:t>
-      </w:r>
-    </w:p>
-    <w:p>
-      <w:r>
-        <w:t xml:space="preserve">2. ГОСТ Р 7.0.100-2018 "Библиографическая запись. Библиографическое описание". [источник]</w:t>
-      </w:r>
-    </w:p>
-    <w:p>
-      <w:r>
-        <w:t xml:space="preserve">3. ISO/IEC 25010:2011 Systems and software quality models. [источник]</w:t>
-      </w:r>
-    </w:p>
-    <w:p>
-      <w:r>
-        <w:t xml:space="preserve">4. ISO/IEC/IEEE 12207:2017 Software life cycle processes. [источник]</w:t>
-      </w:r>
-    </w:p>
-    <w:p>
-      <w:r>
-        <w:t xml:space="preserve">5. IEEE 1016 Systems and software design descriptions. [источник]</w:t>
+        <w:t xml:space="preserve">1. ГОСТ 7.32-2017 "Отчет о научно-исследовательской работе. Структура и правила оформления". [источник] 2. ГОСТ Р 7.0.100-2018 "Библиографическая запись. Библиографическое описание". [источник] 3. ISO/IEC 25010:2011 Systems and software quality models. [источник] 4. ISO/IEC/IEEE 12207:2017 Software life cycle processes. [источник] 5. IEEE 1016 Systems and software design descriptions. [источник]</w:t>
       </w:r>
     </w:p>
     <w:p>
@@ -129,7 +84,7 @@
     </w:p>
     <w:p>
       <w:r>
-        <w:t xml:space="preserve">Этот файл подготовлен как рабочая основа. Следующий шаг — указать конкретную главу, раздел или подраздел, который нужно написать или доработать в дипломной работе.</w:t>
+        <w:t xml:space="preserve">Этот файл подготовлен как рабочая основа. Следующий шаг - указать конкретную главу, раздел или подраздел, который нужно написать или доработать в дипломной работе.</w:t>
       </w:r>
     </w:p>
     <w:sectPr>

</xml_diff>